<commit_message>
modal and nav fix
</commit_message>
<xml_diff>
--- a/src/assets/cv/Lital_Gottlieb_CV.docx
+++ b/src/assets/cv/Lital_Gottlieb_CV.docx
@@ -138,7 +138,21 @@
         <w:rPr>
           <w:rFonts w:ascii="Calibri" w:eastAsia="Calibri" w:hAnsi="Calibri" w:cs="Calibri"/>
         </w:rPr>
-        <w:t xml:space="preserve">   Github:  </w:t>
+        <w:t xml:space="preserve">   </w:t>
+      </w:r>
+      <w:proofErr w:type="spellStart"/>
+      <w:r>
+        <w:rPr>
+          <w:rFonts w:ascii="Calibri" w:eastAsia="Calibri" w:hAnsi="Calibri" w:cs="Calibri"/>
+        </w:rPr>
+        <w:t>Github</w:t>
+      </w:r>
+      <w:proofErr w:type="spellEnd"/>
+      <w:r>
+        <w:rPr>
+          <w:rFonts w:ascii="Calibri" w:eastAsia="Calibri" w:hAnsi="Calibri" w:cs="Calibri"/>
+        </w:rPr>
+        <w:t xml:space="preserve">:  </w:t>
       </w:r>
       <w:hyperlink r:id="rId8" w:history="1">
         <w:r>
@@ -146,21 +160,7 @@
             <w:rStyle w:val="Hyperlink"/>
             <w:rFonts w:ascii="Calibri" w:eastAsia="Calibri" w:hAnsi="Calibri" w:cs="Calibri"/>
           </w:rPr>
-          <w:t>https://gith</w:t>
-        </w:r>
-        <w:r>
-          <w:rPr>
-            <w:rStyle w:val="Hyperlink"/>
-            <w:rFonts w:ascii="Calibri" w:eastAsia="Calibri" w:hAnsi="Calibri" w:cs="Calibri"/>
-          </w:rPr>
-          <w:t>u</w:t>
-        </w:r>
-        <w:r>
-          <w:rPr>
-            <w:rStyle w:val="Hyperlink"/>
-            <w:rFonts w:ascii="Calibri" w:eastAsia="Calibri" w:hAnsi="Calibri" w:cs="Calibri"/>
-          </w:rPr>
-          <w:t>b.com/litalg8</w:t>
+          <w:t>https://github.com/litalg8</w:t>
         </w:r>
       </w:hyperlink>
       <w:r>
@@ -521,8 +521,6 @@
         </w:rPr>
         <w:t xml:space="preserve"> (Flex and Grid). </w:t>
       </w:r>
-      <w:bookmarkStart w:id="0" w:name="_GoBack"/>
-      <w:bookmarkEnd w:id="0"/>
       <w:r>
         <w:rPr>
           <w:rFonts w:asciiTheme="minorHAnsi" w:eastAsia="MS Mincho" w:hAnsiTheme="minorHAnsi"/>
@@ -846,7 +844,7 @@
         <w:rPr>
           <w:rFonts w:ascii="Calibri" w:eastAsia="Calibri" w:hAnsi="Calibri" w:cs="Calibri"/>
         </w:rPr>
-        <w:t>2018-2019</w:t>
+        <w:t>2018-2020</w:t>
       </w:r>
       <w:r>
         <w:rPr>
@@ -871,13 +869,19 @@
         <w:rPr>
           <w:rFonts w:ascii="Calibri" w:eastAsia="Calibri" w:hAnsi="Calibri" w:cs="Calibri"/>
         </w:rPr>
-        <w:t>Executed professional design</w:t>
-      </w:r>
-      <w:r>
-        <w:rPr>
-          <w:rFonts w:ascii="Calibri" w:eastAsia="Calibri" w:hAnsi="Calibri" w:cs="Calibri"/>
-        </w:rPr>
-        <w:t xml:space="preserve"> sheets for both print &amp; web.</w:t>
+        <w:t xml:space="preserve">Tailored </w:t>
+      </w:r>
+      <w:r>
+        <w:rPr>
+          <w:rFonts w:ascii="Calibri" w:eastAsia="Calibri" w:hAnsi="Calibri" w:cs="Calibri"/>
+        </w:rPr>
+        <w:t>design</w:t>
+      </w:r>
+      <w:r>
+        <w:rPr>
+          <w:rFonts w:ascii="Calibri" w:eastAsia="Calibri" w:hAnsi="Calibri" w:cs="Calibri"/>
+        </w:rPr>
+        <w:t xml:space="preserve"> sheets according to each client’s branding aesthetic. </w:t>
       </w:r>
     </w:p>
     <w:p>
@@ -896,7 +900,58 @@
         <w:rPr>
           <w:rFonts w:ascii="Calibri" w:eastAsia="Calibri" w:hAnsi="Calibri" w:cs="Calibri"/>
         </w:rPr>
-        <w:t>Developed a quick and efficient techniques for pixel perfect designs</w:t>
+        <w:t xml:space="preserve">Developed </w:t>
+      </w:r>
+      <w:r>
+        <w:rPr>
+          <w:rFonts w:ascii="Calibri" w:eastAsia="Calibri" w:hAnsi="Calibri" w:cs="Calibri"/>
+        </w:rPr>
+        <w:t>quick and efficient techniques for pixel</w:t>
+      </w:r>
+      <w:bookmarkStart w:id="0" w:name="_GoBack"/>
+      <w:bookmarkEnd w:id="0"/>
+      <w:r>
+        <w:rPr>
+          <w:rFonts w:ascii="Calibri" w:eastAsia="Calibri" w:hAnsi="Calibri" w:cs="Calibri"/>
+        </w:rPr>
+        <w:t xml:space="preserve"> perfect designs</w:t>
+      </w:r>
+      <w:r>
+        <w:rPr>
+          <w:rFonts w:ascii="Calibri" w:eastAsia="Calibri" w:hAnsi="Calibri" w:cs="Calibri"/>
+        </w:rPr>
+        <w:t>.</w:t>
+      </w:r>
+    </w:p>
+    <w:p>
+      <w:pPr>
+        <w:pStyle w:val="ListParagraph"/>
+        <w:numPr>
+          <w:ilvl w:val="0"/>
+          <w:numId w:val="1"/>
+        </w:numPr>
+        <w:spacing w:after="200" w:line="240" w:lineRule="auto"/>
+        <w:rPr>
+          <w:rFonts w:ascii="Calibri" w:eastAsia="Calibri" w:hAnsi="Calibri" w:cs="Calibri"/>
+        </w:rPr>
+      </w:pPr>
+      <w:r>
+        <w:rPr>
+          <w:rFonts w:ascii="Calibri" w:eastAsia="Calibri" w:hAnsi="Calibri" w:cs="Calibri"/>
+        </w:rPr>
+        <w:t xml:space="preserve">Revitalized website </w:t>
+      </w:r>
+      <w:r>
+        <w:rPr>
+          <w:rFonts w:ascii="Calibri" w:eastAsia="Calibri" w:hAnsi="Calibri" w:cs="Calibri"/>
+        </w:rPr>
+        <w:t>for a better u</w:t>
+      </w:r>
+      <w:r>
+        <w:rPr>
+          <w:rFonts w:ascii="Calibri" w:eastAsia="Calibri" w:hAnsi="Calibri" w:cs="Calibri"/>
+        </w:rPr>
+        <w:t xml:space="preserve">ser experience. </w:t>
       </w:r>
     </w:p>
     <w:p>
@@ -1005,7 +1060,13 @@
         <w:rPr>
           <w:rFonts w:ascii="Calibri" w:eastAsia="Calibri" w:hAnsi="Calibri" w:cs="Calibri"/>
         </w:rPr>
-        <w:t>Communicated with different department heads.</w:t>
+        <w:t>Streamlined communication between</w:t>
+      </w:r>
+      <w:r>
+        <w:rPr>
+          <w:rFonts w:ascii="Calibri" w:eastAsia="Calibri" w:hAnsi="Calibri" w:cs="Calibri"/>
+        </w:rPr>
+        <w:t xml:space="preserve"> different department heads.</w:t>
       </w:r>
     </w:p>
     <w:p>
@@ -1024,7 +1085,13 @@
         <w:rPr>
           <w:rFonts w:ascii="Calibri" w:eastAsia="Calibri" w:hAnsi="Calibri" w:cs="Calibri"/>
         </w:rPr>
-        <w:t>Customized UI/UX designs for B2B sites</w:t>
+        <w:t>Custom</w:t>
+      </w:r>
+      <w:r>
+        <w:rPr>
+          <w:rFonts w:ascii="Calibri" w:eastAsia="Calibri" w:hAnsi="Calibri" w:cs="Calibri"/>
+        </w:rPr>
+        <w:t xml:space="preserve">ized UI/UX designs for B2B. </w:t>
       </w:r>
     </w:p>
     <w:p>
@@ -1043,13 +1110,31 @@
         <w:rPr>
           <w:rFonts w:ascii="Calibri" w:eastAsia="Calibri" w:hAnsi="Calibri" w:cs="Calibri"/>
         </w:rPr>
-        <w:t xml:space="preserve">Created promotional </w:t>
-      </w:r>
-      <w:r>
-        <w:rPr>
-          <w:rFonts w:ascii="Calibri" w:eastAsia="Calibri" w:hAnsi="Calibri" w:cs="Calibri"/>
-        </w:rPr>
-        <w:t xml:space="preserve">social media designs for Facebook and </w:t>
+        <w:t xml:space="preserve">Strengthened social media presence </w:t>
+      </w:r>
+      <w:r>
+        <w:rPr>
+          <w:rFonts w:ascii="Calibri" w:eastAsia="Calibri" w:hAnsi="Calibri" w:cs="Calibri"/>
+        </w:rPr>
+        <w:t xml:space="preserve">with strong </w:t>
+      </w:r>
+      <w:r>
+        <w:rPr>
+          <w:rFonts w:ascii="Calibri" w:eastAsia="Calibri" w:hAnsi="Calibri" w:cs="Calibri"/>
+        </w:rPr>
+        <w:t>designs for</w:t>
+      </w:r>
+      <w:r>
+        <w:rPr>
+          <w:rFonts w:ascii="Calibri" w:eastAsia="Calibri" w:hAnsi="Calibri" w:cs="Calibri"/>
+        </w:rPr>
+        <w:t xml:space="preserve"> </w:t>
+      </w:r>
+      <w:r>
+        <w:rPr>
+          <w:rFonts w:ascii="Calibri" w:eastAsia="Calibri" w:hAnsi="Calibri" w:cs="Calibri"/>
+        </w:rPr>
+        <w:t xml:space="preserve">Facebook and </w:t>
       </w:r>
       <w:proofErr w:type="spellStart"/>
       <w:r>
@@ -1135,25 +1220,13 @@
         <w:rPr>
           <w:rFonts w:ascii="Calibri" w:eastAsia="Calibri" w:hAnsi="Calibri" w:cs="Calibri"/>
         </w:rPr>
-        <w:t>Responsible</w:t>
-      </w:r>
-      <w:r>
-        <w:rPr>
-          <w:rFonts w:ascii="Calibri" w:eastAsia="Calibri" w:hAnsi="Calibri" w:cs="Calibri"/>
-        </w:rPr>
-        <w:t xml:space="preserve"> for managing </w:t>
-      </w:r>
-      <w:r>
-        <w:rPr>
-          <w:rFonts w:ascii="Calibri" w:eastAsia="Calibri" w:hAnsi="Calibri" w:cs="Calibri"/>
-        </w:rPr>
-        <w:t>Facebook</w:t>
-      </w:r>
-      <w:r>
-        <w:rPr>
-          <w:rFonts w:ascii="Calibri" w:eastAsia="Calibri" w:hAnsi="Calibri" w:cs="Calibri"/>
-        </w:rPr>
-        <w:t xml:space="preserve"> pages and campaigns</w:t>
+        <w:t xml:space="preserve">Engaged </w:t>
+      </w:r>
+      <w:r>
+        <w:rPr>
+          <w:rFonts w:ascii="Calibri" w:eastAsia="Calibri" w:hAnsi="Calibri" w:cs="Calibri"/>
+        </w:rPr>
+        <w:t>clients with strong social media campaigns</w:t>
       </w:r>
       <w:r>
         <w:rPr>
@@ -1178,29 +1251,48 @@
         <w:rPr>
           <w:rFonts w:ascii="Calibri" w:eastAsia="Calibri" w:hAnsi="Calibri" w:cs="Calibri"/>
         </w:rPr>
-        <w:t>Desi</w:t>
-      </w:r>
-      <w:r>
-        <w:rPr>
-          <w:rFonts w:ascii="Calibri" w:eastAsia="Calibri" w:hAnsi="Calibri" w:cs="Calibri"/>
-        </w:rPr>
-        <w:t xml:space="preserve">gned all promotional materials for their many business clients. </w:t>
-      </w:r>
-      <w:r>
-        <w:rPr>
-          <w:rFonts w:ascii="Calibri" w:eastAsia="Calibri" w:hAnsi="Calibri" w:cs="Calibri"/>
-        </w:rPr>
-        <w:br/>
-      </w:r>
-      <w:r>
-        <w:rPr>
-          <w:rFonts w:ascii="Calibri" w:eastAsia="Calibri" w:hAnsi="Calibri" w:cs="Calibri"/>
-        </w:rPr>
-        <w:tab/>
+        <w:t xml:space="preserve">Spearheaded social media campaigns for multiple business clients. </w:t>
       </w:r>
     </w:p>
     <w:p>
       <w:pPr>
+        <w:pStyle w:val="ListParagraph"/>
+        <w:numPr>
+          <w:ilvl w:val="0"/>
+          <w:numId w:val="2"/>
+        </w:numPr>
+        <w:spacing w:after="200" w:line="240" w:lineRule="auto"/>
+        <w:rPr>
+          <w:rFonts w:ascii="Calibri" w:eastAsia="Calibri" w:hAnsi="Calibri" w:cs="Calibri"/>
+        </w:rPr>
+      </w:pPr>
+      <w:r>
+        <w:rPr>
+          <w:rFonts w:ascii="Calibri" w:eastAsia="Calibri" w:hAnsi="Calibri" w:cs="Calibri"/>
+        </w:rPr>
+        <w:t xml:space="preserve">Designed all promotional materials for </w:t>
+      </w:r>
+      <w:r>
+        <w:rPr>
+          <w:rFonts w:ascii="Calibri" w:eastAsia="Calibri" w:hAnsi="Calibri" w:cs="Calibri"/>
+        </w:rPr>
+        <w:t xml:space="preserve">all of the office </w:t>
+      </w:r>
+      <w:r>
+        <w:rPr>
+          <w:rFonts w:ascii="Calibri" w:eastAsia="Calibri" w:hAnsi="Calibri" w:cs="Calibri"/>
+        </w:rPr>
+        <w:t>business clients.</w:t>
+      </w:r>
+      <w:r>
+        <w:rPr>
+          <w:rFonts w:ascii="Calibri" w:eastAsia="Calibri" w:hAnsi="Calibri" w:cs="Calibri"/>
+        </w:rPr>
+        <w:tab/>
+      </w:r>
+    </w:p>
+    <w:p>
+      <w:pPr>
         <w:spacing w:after="200" w:line="240" w:lineRule="auto"/>
         <w:rPr>
           <w:rFonts w:ascii="Calibri" w:eastAsia="Calibri" w:hAnsi="Calibri" w:cs="Calibri"/>
@@ -1296,11 +1388,6 @@
         </w:rPr>
         <w:tab/>
       </w:r>
-    </w:p>
-    <w:p>
-      <w:pPr>
-        <w:spacing w:after="200" w:line="240" w:lineRule="auto"/>
-      </w:pPr>
       <w:r>
         <w:rPr>
           <w:rFonts w:ascii="Calibri" w:eastAsia="Calibri" w:hAnsi="Calibri" w:cs="Calibri"/>
@@ -3124,7 +3211,7 @@
   <a:extraClrSchemeLst/>
   <a:extLst>
     <a:ext uri="{05A4C25C-085E-4340-85A3-A5531E510DB2}">
-      <thm15:themeFamily xmlns="" xmlns:thm15="http://schemas.microsoft.com/office/thememl/2012/main" name="Office Theme" id="{62F939B6-93AF-4DB8-9C6B-D6C7DFDC589F}" vid="{4A3C46E8-61CC-4603-A589-7422A47A8E4A}"/>
+      <thm15:themeFamily xmlns:thm15="http://schemas.microsoft.com/office/thememl/2012/main" xmlns="" name="Office Theme" id="{62F939B6-93AF-4DB8-9C6B-D6C7DFDC589F}" vid="{4A3C46E8-61CC-4603-A589-7422A47A8E4A}"/>
     </a:ext>
   </a:extLst>
 </a:theme>

</xml_diff>